<commit_message>
Official Documentation & Team Contribution
</commit_message>
<xml_diff>
--- a/Cipher Breach Documentation.docx
+++ b/Cipher Breach Documentation.docx
@@ -371,11 +371,6 @@
     </w:p>
     <w:p>
       <w:pPr>
-        <w:spacing w:after="0"/>
-      </w:pPr>
-    </w:p>
-    <w:p>
-      <w:pPr>
         <w:pStyle w:val="Heading1"/>
         <w:spacing w:before="80" w:after="100"/>
         <w:rPr>
@@ -386,6 +381,7 @@
         <w:rPr>
           <w:color w:val="auto"/>
         </w:rPr>
+        <w:lastRenderedPageBreak/>
         <w:t>1. Project Overview</w:t>
       </w:r>
     </w:p>
@@ -1053,7 +1049,6 @@
         <w:rPr>
           <w:color w:val="auto"/>
         </w:rPr>
-        <w:lastRenderedPageBreak/>
         <w:t>QR code for opening the deployed game.</w:t>
       </w:r>
     </w:p>
@@ -1069,6 +1064,7 @@
         <w:rPr>
           <w:color w:val="auto"/>
         </w:rPr>
+        <w:lastRenderedPageBreak/>
         <w:t>2. Design Philosophy</w:t>
       </w:r>
     </w:p>

</xml_diff>